<commit_message>
Daftar perangkat rev 1.2: dimensi CH besar ± Ø76 × 104 mm (hasil ukur)
Co-Authored-By: Claude Opus 5.5 <noreply@anthropic.com>
</commit_message>
<xml_diff>
--- a/Deliverables/Daftar_Perangkat_dan_Kebutuhan_Pemasangan_GLD_RU-IV_Cilacap.docx
+++ b/Deliverables/Daftar_Perangkat_dan_Kebutuhan_Pemasangan_GLD_RU-IV_Cilacap.docx
@@ -156,7 +156,7 @@
               <w:rPr>
                 <w:sz w:val="19"/>
               </w:rPr>
-              <w:t>1.1</w:t>
+              <w:t>1.2</w:t>
             </w:r>
           </w:p>
         </w:tc>
@@ -648,7 +648,7 @@
               <w:rPr>
                 <w:sz w:val="18"/>
               </w:rPr>
-              <w:t>8 × 8 × 21 cm, enclosure metal</w:t>
+              <w:t>CH besar: enclosure aluminium silinder ± Ø76 × 104 mm (+ konektor ± 15 mm)</w:t>
             </w:r>
           </w:p>
           <w:p>
@@ -2478,7 +2478,7 @@
         <w:color w:val="5B5B5B"/>
         <w:sz w:val="16"/>
       </w:rPr>
-      <w:t xml:space="preserve">LGU/GLD/INSTALASI-PERANGKAT/2026-001  ·  Rev. 1.1  ·  2 Oktober 2026  ·  Halaman </w:t>
+      <w:t xml:space="preserve">LGU/GLD/INSTALASI-PERANGKAT/2026-001  ·  Rev. 1.2  ·  2 Oktober 2026  ·  Halaman </w:t>
     </w:r>
     <w:r>
       <w:rPr>

</xml_diff>

<commit_message>
Sinkronkan dokumen instalasi Cilacap ke block diagram final 8 Okt (Spesifikasi rev 1.6, Daftar Perangkat rev 1.3)
Co-Authored-By: Claude Opus 5.5 <noreply@anthropic.com>
Claude-Session: https://claude.ai/code/session_01Q3Dfekejoa9xybKRVuzHDc
</commit_message>
<xml_diff>
--- a/Deliverables/Daftar_Perangkat_dan_Kebutuhan_Pemasangan_GLD_RU-IV_Cilacap.docx
+++ b/Deliverables/Daftar_Perangkat_dan_Kebutuhan_Pemasangan_GLD_RU-IV_Cilacap.docx
@@ -156,7 +156,7 @@
               <w:rPr>
                 <w:sz w:val="19"/>
               </w:rPr>
-              <w:t>1.2</w:t>
+              <w:t>1.3</w:t>
             </w:r>
           </w:p>
         </w:tc>
@@ -193,7 +193,7 @@
               <w:rPr>
                 <w:sz w:val="19"/>
               </w:rPr>
-              <w:t>2 Oktober 2026</w:t>
+              <w:t>9 Oktober 2026</w:t>
             </w:r>
           </w:p>
         </w:tc>
@@ -741,7 +741,7 @@
               <w:rPr>
                 <w:sz w:val="18"/>
               </w:rPr>
-              <w:t>5 V via adaptor; maks 0,73 W</w:t>
+              <w:t>5 VDC via adaptor, dicatu dari UPS; maks 0,73 W</w:t>
             </w:r>
           </w:p>
           <w:p>
@@ -763,7 +763,7 @@
               <w:rPr>
                 <w:sz w:val="18"/>
               </w:rPr>
-              <w:t>Antena omni 8 dBi; uplink Wi-Fi ke PC server</w:t>
+              <w:t>Antena omni 8 dBi; uplink Wi-Fi 2,4 GHz ke router LGU</w:t>
             </w:r>
           </w:p>
         </w:tc>
@@ -897,7 +897,7 @@
                 <w:b/>
                 <w:sz w:val="18"/>
               </w:rPr>
-              <w:t>Router jaringan field</w:t>
+              <w:t>Router Wi-Fi 2,4 GHz</w:t>
             </w:r>
           </w:p>
         </w:tc>
@@ -929,7 +929,18 @@
               <w:rPr>
                 <w:sz w:val="18"/>
               </w:rPr>
-              <w:t>Jaringan lokal Gateway ↔ PC server (independen dari jaringan kilang)</w:t>
+              <w:t>Jaringan lokal Gateway ↔ PC server tanpa internet (independen dari jaringan kilang)</w:t>
+            </w:r>
+          </w:p>
+          <w:p>
+            <w:pPr>
+              <w:spacing w:after="20"/>
+            </w:pPr>
+            <w:r>
+              <w:rPr>
+                <w:sz w:val="18"/>
+              </w:rPr>
+              <w:t>Gateway → router Wi-Fi 2,4 GHz; router → PC server LAN Cat6; adaptor dicatu dari UPS</w:t>
             </w:r>
           </w:p>
         </w:tc>
@@ -945,7 +956,7 @@
               <w:rPr>
                 <w:sz w:val="18"/>
               </w:rPr>
-              <w:t>Bersama PC server</w:t>
+              <w:t>Satu ruangan dengan Gateway</w:t>
             </w:r>
           </w:p>
         </w:tc>
@@ -1179,7 +1190,18 @@
               <w:rPr>
                 <w:sz w:val="18"/>
               </w:rPr>
-              <w:t>Struktur pemasangan: pipa/handrail 2" (DN50, OD 60,3 mm) di titik pasang</w:t>
+              <w:t>Junction box SS316 berisi PSU 220 VAC→24 VDC dari local receptacle; kabel 24 VDC 2C 16 AWG</w:t>
+            </w:r>
+          </w:p>
+          <w:p>
+            <w:pPr>
+              <w:spacing w:after="20"/>
+            </w:pPr>
+            <w:r>
+              <w:rPr>
+                <w:sz w:val="18"/>
+              </w:rPr>
+              <w:t>Struktur pemasangan: stanchion/tiang 2" HDG (DN50, OD 60,3 mm) di titik pasang</w:t>
             </w:r>
           </w:p>
           <w:p>
@@ -1390,7 +1412,18 @@
               <w:rPr>
                 <w:sz w:val="18"/>
               </w:rPr>
-              <w:t>Ruang indoor di area aman + stopkontak untuk adaptor 5 V</w:t>
+              <w:t>Ruang indoor di area aman + mounting support Gateway</w:t>
+            </w:r>
+          </w:p>
+          <w:p>
+            <w:pPr>
+              <w:spacing w:after="20"/>
+            </w:pPr>
+            <w:r>
+              <w:rPr>
+                <w:sz w:val="18"/>
+              </w:rPr>
+              <w:t>UPS yang mencatu adaptor 5 VDC Gateway, adaptor router, dan PC server</w:t>
             </w:r>
           </w:p>
           <w:p>
@@ -1456,7 +1489,7 @@
               <w:rPr>
                 <w:sz w:val="18"/>
               </w:rPr>
-              <w:t>Unit PC fisik sesuai spesifikasi minimum (bagian 2), ditempatkan dekat Gateway, dengan catu daya</w:t>
+              <w:t>Unit PC fisik sesuai spesifikasi minimum (bagian 2), ditempatkan dekat Gateway, dicatu dari UPS</w:t>
             </w:r>
           </w:p>
           <w:p>
@@ -2478,7 +2511,7 @@
         <w:color w:val="5B5B5B"/>
         <w:sz w:val="16"/>
       </w:rPr>
-      <w:t xml:space="preserve">LGU/GLD/INSTALASI-PERANGKAT/2026-001  ·  Rev. 1.2  ·  2 Oktober 2026  ·  Halaman </w:t>
+      <w:t xml:space="preserve">LGU/GLD/INSTALASI-PERANGKAT/2026-001  ·  Rev. 1.3  ·  9 Oktober 2026  ·  Halaman </w:t>
     </w:r>
     <w:r>
       <w:rPr>

</xml_diff>